<commit_message>
manuscript: add cross-cultural generalizability limitation (findings tied to Japan's liability/compensation/reimbursement context)
Co-Authored-By: Tatsuki Onishi <bougtoir@gmail.com>
</commit_message>
<xml_diff>
--- a/medical_accident_its_analysis/manuscript/manuscript_en.docx
+++ b/medical_accident_its_analysis/manuscript/manuscript_en.docx
@@ -3204,7 +3204,7 @@
           <w:i w:val="0"/>
           <w:sz w:val="24"/>
         </w:rPr>
-        <w:t>This is an ecological, specialty-level analysis and cannot speak to individual career decisions. The physician census is biennial, giving nine measured waves; we addressed the limited power directly through equivalence testing and by pooling across specialties, but residual power constraints remain and the equivalence margins are a judgement. Specialty-specific litigation could be recovered only from 2008; earlier specialty tables were not retrievable from primary sources. Clinic counts by specialty are published only every three years and were used descriptively. Finally, litigation counts are assigned to a principal specialty and, by the Court's own note, do not measure intrinsic specialty risk.</w:t>
+        <w:t>This is an ecological, specialty-level analysis and cannot speak to individual career decisions. The physician census is biennial, giving nine measured waves; we addressed the limited power directly through equivalence testing and by pooling across specialties, but residual power constraints remain and the equivalence margins are a judgement. Specialty-specific litigation could be recovered only from 2008; earlier specialty tables were not retrievable from primary sources. Clinic counts by specialty are published only every three years and were used descriptively. Litigation counts are assigned to a principal specialty and, by the Court's own note, do not measure intrinsic specialty risk.</w:t>
       </w:r>
       <w:r>
         <w:rPr>
@@ -3213,6 +3213,15 @@
           <w:vertAlign w:val="superscript"/>
         </w:rPr>
         <w:t>9</w:t>
+      </w:r>
+      <w:r>
+        <w:rPr>
+          <w:rFonts w:ascii="Times New Roman" w:hAnsi="Times New Roman"/>
+          <w:b w:val="0"/>
+          <w:i w:val="0"/>
+          <w:sz w:val="24"/>
+        </w:rPr>
+        <w:t xml:space="preserve"> Finally, these findings are embedded in Japan's particular legal, cultural and institutional context—including its no-fault obstetric compensation scheme, its fee-for-service reimbursement structure and its comparatively low-volume malpractice-litigation culture—so physician responses to litigation risk may differ in health systems with different liability regimes, compensation mechanisms or professional norms; the results should not be assumed to generalise across cultural spheres.</w:t>
       </w:r>
     </w:p>
     <w:p>

</xml_diff>